<commit_message>
Création manuel PBI-DAX pour M2i
</commit_message>
<xml_diff>
--- a/Manuel PBI DAX/[Word] Modèle M2I 2025.docx
+++ b/Manuel PBI DAX/[Word] Modèle M2I 2025.docx
@@ -126,10 +126,13 @@
                               <w:pStyle w:val="Titre"/>
                             </w:pPr>
                             <w:r>
-                              <w:t xml:space="preserve">TITRE </w:t>
+                              <w:t>POWER BI</w:t>
                             </w:r>
                             <w:r>
-                              <w:t>FORMATION</w:t>
+                              <w:t xml:space="preserve"> </w:t>
+                            </w:r>
+                            <w:r>
+                              <w:t>Expertise DAX</w:t>
                             </w:r>
                           </w:p>
                         </w:txbxContent>
@@ -163,10 +166,13 @@
                         <w:pStyle w:val="Titre"/>
                       </w:pPr>
                       <w:r>
-                        <w:t xml:space="preserve">TITRE </w:t>
+                        <w:t>POWER BI</w:t>
                       </w:r>
                       <w:r>
-                        <w:t>FORMATION</w:t>
+                        <w:t xml:space="preserve"> </w:t>
+                      </w:r>
+                      <w:r>
+                        <w:t>Expertise DAX</w:t>
                       </w:r>
                     </w:p>
                   </w:txbxContent>
@@ -228,7 +234,13 @@
                               <w:pStyle w:val="Sous-titre"/>
                             </w:pPr>
                             <w:r>
-                              <w:t>Référence / Sous-titre</w:t>
+                              <w:t>PBI-DAX</w:t>
+                            </w:r>
+                            <w:r>
+                              <w:t xml:space="preserve"> / </w:t>
+                            </w:r>
+                            <w:r>
+                              <w:t>Contextes, patterns et calculs industrialisés</w:t>
                             </w:r>
                           </w:p>
                         </w:txbxContent>
@@ -258,7 +270,13 @@
                         <w:pStyle w:val="Sous-titre"/>
                       </w:pPr>
                       <w:r>
-                        <w:t>Référence / Sous-titre</w:t>
+                        <w:t>PBI-DAX</w:t>
+                      </w:r>
+                      <w:r>
+                        <w:t xml:space="preserve"> / </w:t>
+                      </w:r>
+                      <w:r>
+                        <w:t>Contextes, patterns et calculs industrialisés</w:t>
                       </w:r>
                     </w:p>
                   </w:txbxContent>
@@ -347,13 +365,13 @@
           <w:r>
             <w:fldChar w:fldCharType="separate"/>
           </w:r>
-          <w:hyperlink w:anchor="_Toc210637815" w:history="1">
+          <w:hyperlink w:anchor="_Toc228265180" w:history="1">
             <w:r>
               <w:rPr>
                 <w:rStyle w:val="Lienhypertexte"/>
                 <w:noProof/>
               </w:rPr>
-              <w:t>TITRE</w:t>
+              <w:t>Chapitre 1 — Les contextes DAX</w:t>
             </w:r>
             <w:r>
               <w:rPr>
@@ -374,7 +392,7 @@
                 <w:noProof/>
                 <w:webHidden/>
               </w:rPr>
-              <w:instrText xml:space="preserve"> PAGEREF _Toc210637815 \h </w:instrText>
+              <w:instrText xml:space="preserve"> PAGEREF _Toc228265180 \h </w:instrText>
             </w:r>
             <w:r>
               <w:rPr>
@@ -419,13 +437,13 @@
               <w:lang w:eastAsia="fr-FR"/>
             </w:rPr>
           </w:pPr>
-          <w:hyperlink w:anchor="_Toc210637816" w:history="1">
+          <w:hyperlink w:anchor="_Toc228265181" w:history="1">
             <w:r>
               <w:rPr>
                 <w:rStyle w:val="Lienhypertexte"/>
                 <w:noProof/>
               </w:rPr>
-              <w:t>Sous-titre</w:t>
+              <w:t>Rappels : contexte de ligne vs contexte de filtre</w:t>
             </w:r>
             <w:r>
               <w:rPr>
@@ -446,7 +464,7 @@
                 <w:noProof/>
                 <w:webHidden/>
               </w:rPr>
-              <w:instrText xml:space="preserve"> PAGEREF _Toc210637816 \h </w:instrText>
+              <w:instrText xml:space="preserve"> PAGEREF _Toc228265181 \h </w:instrText>
             </w:r>
             <w:r>
               <w:rPr>
@@ -496,33 +514,91 @@
     <w:p>
       <w:pPr>
         <w:pStyle w:val="Titre1"/>
-      </w:pPr>
-      <w:bookmarkStart w:id="0" w:name="_Toc210637707"/>
-      <w:bookmarkStart w:id="1" w:name="_Toc210637815"/>
+        <w:rPr>
+          <w:b/>
+          <w:bCs/>
+        </w:rPr>
+      </w:pPr>
+      <w:bookmarkStart w:id="0" w:name="_Toc210637708"/>
+      <w:bookmarkStart w:id="1" w:name="_Toc228265180"/>
       <w:r>
         <w:lastRenderedPageBreak/>
-        <w:t>TITRE</w:t>
+        <w:t>Chapitre 1 — Les contextes DAX</w:t>
       </w:r>
-      <w:bookmarkEnd w:id="0"/>
       <w:bookmarkEnd w:id="1"/>
     </w:p>
     <w:p>
       <w:pPr>
+        <w:spacing w:before="80" w:after="80"/>
+      </w:pPr>
+      <w:r>
+        <w:t>Les contextes d’évaluation sont le cœur du moteur DAX. Comprendre leur fonctionnement est indispensable pour écrire des mesures correctes, prévisibles et maintenables.</w:t>
+      </w:r>
+    </w:p>
+    <w:p/>
+    <w:p>
+      <w:pPr>
         <w:pStyle w:val="Titre2"/>
       </w:pPr>
-      <w:bookmarkStart w:id="2" w:name="_Toc210637708"/>
-      <w:bookmarkStart w:id="3" w:name="_Toc210637816"/>
+      <w:bookmarkStart w:id="2" w:name="_Toc228265181"/>
+      <w:bookmarkEnd w:id="0"/>
       <w:r>
-        <w:t>Sous-titre</w:t>
+        <w:t>C</w:t>
+      </w:r>
+      <w:r>
+        <w:t>ontexte de ligne vs contexte de filtre</w:t>
       </w:r>
       <w:bookmarkEnd w:id="2"/>
-      <w:bookmarkEnd w:id="3"/>
     </w:p>
     <w:p>
+      <w:pPr>
+        <w:pStyle w:val="Paragraphedeliste"/>
+        <w:numPr>
+          <w:ilvl w:val="1"/>
+          <w:numId w:val="4"/>
+        </w:numPr>
+      </w:pPr>
       <w:r>
-        <w:t>Paragraphe</w:t>
+        <w:t>Contexte de ligne</w:t>
       </w:r>
     </w:p>
+    <w:p>
+      <w:pPr>
+        <w:spacing w:before="80" w:after="80"/>
+      </w:pPr>
+      <w:r>
+        <w:t>Le contexte de ligne est créé automatiquement lors de l’itération ligne par ligne d’une table. Il est actif dans :</w:t>
+      </w:r>
+    </w:p>
+    <w:p>
+      <w:pPr>
+        <w:pStyle w:val="Paragraphedeliste"/>
+        <w:numPr>
+          <w:ilvl w:val="0"/>
+          <w:numId w:val="5"/>
+        </w:numPr>
+        <w:spacing w:before="40" w:after="40" w:line="240" w:lineRule="auto"/>
+        <w:contextualSpacing w:val="0"/>
+      </w:pPr>
+      <w:r>
+        <w:t>les colonnes calculées</w:t>
+      </w:r>
+    </w:p>
+    <w:p>
+      <w:pPr>
+        <w:pStyle w:val="Paragraphedeliste"/>
+        <w:numPr>
+          <w:ilvl w:val="0"/>
+          <w:numId w:val="5"/>
+        </w:numPr>
+        <w:spacing w:before="40" w:after="40" w:line="240" w:lineRule="auto"/>
+        <w:contextualSpacing w:val="0"/>
+      </w:pPr>
+      <w:r>
+        <w:t>les fonctions itératives : SUMX, AVERAGEX, MAXX, MINX, FILTER, ADDCOLUMNS…</w:t>
+      </w:r>
+    </w:p>
+    <w:p/>
     <w:p>
       <w:pPr>
         <w:pStyle w:val="Paragraphedeliste"/>
@@ -584,7 +660,7 @@
                     </pic:cNvPicPr>
                   </pic:nvPicPr>
                   <pic:blipFill>
-                    <a:blip r:embed="rId8" cstate="print">
+                    <a:blip r:embed="rId11" cstate="print">
                       <a:extLst>
                         <a:ext uri="{28A0092B-C50C-407E-A947-70E740481C1C}">
                           <a14:useLocalDpi xmlns:a14="http://schemas.microsoft.com/office/drawing/2010/main" val="0"/>
@@ -725,7 +801,7 @@
                     </pic:cNvPicPr>
                   </pic:nvPicPr>
                   <pic:blipFill>
-                    <a:blip r:embed="rId9" cstate="print">
+                    <a:blip r:embed="rId12" cstate="print">
                       <a:extLst>
                         <a:ext uri="{28A0092B-C50C-407E-A947-70E740481C1C}">
                           <a14:useLocalDpi xmlns:a14="http://schemas.microsoft.com/office/drawing/2010/main" val="0"/>
@@ -1245,7 +1321,7 @@
           <w:noProof/>
         </w:rPr>
         <w:drawing>
-          <wp:anchor distT="0" distB="0" distL="114300" distR="114300" simplePos="0" relativeHeight="251663360" behindDoc="0" locked="0" layoutInCell="1" allowOverlap="1" wp14:anchorId="26E5B275" wp14:editId="1E374826">
+          <wp:anchor distT="0" distB="0" distL="114300" distR="114300" simplePos="0" relativeHeight="251663360" behindDoc="0" locked="0" layoutInCell="1" allowOverlap="1" wp14:anchorId="26E5B275" wp14:editId="66843000">
             <wp:simplePos x="0" y="0"/>
             <wp:positionH relativeFrom="page">
               <wp:align>right</wp:align>
@@ -1270,7 +1346,7 @@
                     </pic:cNvPicPr>
                   </pic:nvPicPr>
                   <pic:blipFill>
-                    <a:blip r:embed="rId10" cstate="print">
+                    <a:blip r:embed="rId13" cstate="print">
                       <a:extLst>
                         <a:ext uri="{28A0092B-C50C-407E-A947-70E740481C1C}">
                           <a14:useLocalDpi xmlns:a14="http://schemas.microsoft.com/office/drawing/2010/main" val="0"/>
@@ -1308,10 +1384,10 @@
       </w:r>
     </w:p>
     <w:sectPr>
-      <w:headerReference w:type="default" r:id="rId11"/>
-      <w:footerReference w:type="default" r:id="rId12"/>
-      <w:headerReference w:type="first" r:id="rId13"/>
-      <w:footerReference w:type="first" r:id="rId14"/>
+      <w:headerReference w:type="default" r:id="rId14"/>
+      <w:footerReference w:type="default" r:id="rId15"/>
+      <w:headerReference w:type="first" r:id="rId16"/>
+      <w:footerReference w:type="first" r:id="rId17"/>
       <w:pgSz w:w="11906" w:h="16838"/>
       <w:pgMar w:top="1701" w:right="1418" w:bottom="1418" w:left="1418" w:header="709" w:footer="709" w:gutter="0"/>
       <w:cols w:space="708"/>
@@ -1351,7 +1427,6 @@
         <w:docPartUnique/>
       </w:docPartObj>
     </w:sdtPr>
-    <w:sdtEndPr/>
     <w:sdtContent>
       <w:p>
         <w:pPr>
@@ -1657,6 +1732,64 @@
 <file path=word/numbering.xml><?xml version="1.0" encoding="utf-8"?>
 <w:numbering xmlns:wpc="http://schemas.microsoft.com/office/word/2010/wordprocessingCanvas" xmlns:cx="http://schemas.microsoft.com/office/drawing/2014/chartex" xmlns:cx1="http://schemas.microsoft.com/office/drawing/2015/9/8/chartex" xmlns:cx2="http://schemas.microsoft.com/office/drawing/2015/10/21/chartex" xmlns:cx3="http://schemas.microsoft.com/office/drawing/2016/5/9/chartex" xmlns:cx4="http://schemas.microsoft.com/office/drawing/2016/5/10/chartex" xmlns:cx5="http://schemas.microsoft.com/office/drawing/2016/5/11/chartex" xmlns:cx6="http://schemas.microsoft.com/office/drawing/2016/5/12/chartex" xmlns:cx7="http://schemas.microsoft.com/office/drawing/2016/5/13/chartex" xmlns:cx8="http://schemas.microsoft.com/office/drawing/2016/5/14/chartex" xmlns:mc="http://schemas.openxmlformats.org/markup-compatibility/2006" xmlns:aink="http://schemas.microsoft.com/office/drawing/2016/ink" xmlns:am3d="http://schemas.microsoft.com/office/drawing/2017/model3d" xmlns:o="urn:schemas-microsoft-com:office:office" xmlns:oel="http://schemas.microsoft.com/office/2019/extlst" xmlns:r="http://schemas.openxmlformats.org/officeDocument/2006/relationships" xmlns:m="http://schemas.openxmlformats.org/officeDocument/2006/math" xmlns:v="urn:schemas-microsoft-com:vml" xmlns:wp14="http://schemas.microsoft.com/office/word/2010/wordprocessingDrawing" xmlns:wp="http://schemas.openxmlformats.org/drawingml/2006/wordprocessingDrawing" xmlns:w10="urn:schemas-microsoft-com:office:word" xmlns:w="http://schemas.openxmlformats.org/wordprocessingml/2006/main" xmlns:w14="http://schemas.microsoft.com/office/word/2010/wordml" xmlns:w15="http://schemas.microsoft.com/office/word/2012/wordml" xmlns:w16cex="http://schemas.microsoft.com/office/word/2018/wordml/cex" xmlns:w16cid="http://schemas.microsoft.com/office/word/2016/wordml/cid" xmlns:w16="http://schemas.microsoft.com/office/word/2018/wordml" xmlns:w16du="http://schemas.microsoft.com/office/word/2023/wordml/word16du" xmlns:w16sdtdh="http://schemas.microsoft.com/office/word/2020/wordml/sdtdatahash" xmlns:w16sdtfl="http://schemas.microsoft.com/office/word/2024/wordml/sdtformatlock" xmlns:w16se="http://schemas.microsoft.com/office/word/2015/wordml/symex" xmlns:wpg="http://schemas.microsoft.com/office/word/2010/wordprocessingGroup" xmlns:wpi="http://schemas.microsoft.com/office/word/2010/wordprocessingInk" xmlns:wne="http://schemas.microsoft.com/office/word/2006/wordml" xmlns:wps="http://schemas.microsoft.com/office/word/2010/wordprocessingShape" mc:Ignorable="w14 w15 w16se w16cid w16 w16cex w16sdtdh w16sdtfl w16du wp14">
   <w:abstractNum w:abstractNumId="0" w15:restartNumberingAfterBreak="0">
+    <w:nsid w:val="02CA3D22"/>
+    <w:multiLevelType w:val="hybridMultilevel"/>
+    <w:tmpl w:val="011CD624"/>
+    <w:lvl w:ilvl="0" w:tplc="AE7412F4">
+      <w:start w:val="1"/>
+      <w:numFmt w:val="bullet"/>
+      <w:lvlText w:val="•"/>
+      <w:lvlJc w:val="left"/>
+      <w:pPr>
+        <w:ind w:left="720" w:hanging="360"/>
+      </w:pPr>
+    </w:lvl>
+    <w:lvl w:ilvl="1" w:tplc="80944FE0">
+      <w:start w:val="1"/>
+      <w:numFmt w:val="bullet"/>
+      <w:lvlText w:val="◦"/>
+      <w:lvlJc w:val="left"/>
+      <w:pPr>
+        <w:ind w:left="1080" w:hanging="360"/>
+      </w:pPr>
+    </w:lvl>
+    <w:lvl w:ilvl="2" w:tplc="A3CEC2AE">
+      <w:numFmt w:val="decimal"/>
+      <w:lvlText w:val=""/>
+      <w:lvlJc w:val="left"/>
+    </w:lvl>
+    <w:lvl w:ilvl="3" w:tplc="00CCE148">
+      <w:numFmt w:val="decimal"/>
+      <w:lvlText w:val=""/>
+      <w:lvlJc w:val="left"/>
+    </w:lvl>
+    <w:lvl w:ilvl="4" w:tplc="374A6692">
+      <w:numFmt w:val="decimal"/>
+      <w:lvlText w:val=""/>
+      <w:lvlJc w:val="left"/>
+    </w:lvl>
+    <w:lvl w:ilvl="5" w:tplc="63368D34">
+      <w:numFmt w:val="decimal"/>
+      <w:lvlText w:val=""/>
+      <w:lvlJc w:val="left"/>
+    </w:lvl>
+    <w:lvl w:ilvl="6" w:tplc="6610D6EE">
+      <w:numFmt w:val="decimal"/>
+      <w:lvlText w:val=""/>
+      <w:lvlJc w:val="left"/>
+    </w:lvl>
+    <w:lvl w:ilvl="7" w:tplc="1C08E9CC">
+      <w:numFmt w:val="decimal"/>
+      <w:lvlText w:val=""/>
+      <w:lvlJc w:val="left"/>
+    </w:lvl>
+    <w:lvl w:ilvl="8" w:tplc="D47C20A8">
+      <w:numFmt w:val="decimal"/>
+      <w:lvlText w:val=""/>
+      <w:lvlJc w:val="left"/>
+    </w:lvl>
+  </w:abstractNum>
+  <w:abstractNum w:abstractNumId="1" w15:restartNumberingAfterBreak="0">
     <w:nsid w:val="21FB4310"/>
     <w:multiLevelType w:val="hybridMultilevel"/>
     <w:tmpl w:val="027CBCF8"/>
@@ -1769,7 +1902,7 @@
       </w:rPr>
     </w:lvl>
   </w:abstractNum>
-  <w:abstractNum w:abstractNumId="1" w15:restartNumberingAfterBreak="0">
+  <w:abstractNum w:abstractNumId="2" w15:restartNumberingAfterBreak="0">
     <w:nsid w:val="28796303"/>
     <w:multiLevelType w:val="hybridMultilevel"/>
     <w:tmpl w:val="32CAE17A"/>
@@ -1884,7 +2017,7 @@
       </w:rPr>
     </w:lvl>
   </w:abstractNum>
-  <w:abstractNum w:abstractNumId="2" w15:restartNumberingAfterBreak="0">
+  <w:abstractNum w:abstractNumId="3" w15:restartNumberingAfterBreak="0">
     <w:nsid w:val="2AED7266"/>
     <w:multiLevelType w:val="hybridMultilevel"/>
     <w:tmpl w:val="A2A4E6A2"/>
@@ -1998,14 +2131,136 @@
       </w:rPr>
     </w:lvl>
   </w:abstractNum>
+  <w:abstractNum w:abstractNumId="4" w15:restartNumberingAfterBreak="0">
+    <w:nsid w:val="36064C54"/>
+    <w:multiLevelType w:val="multilevel"/>
+    <w:tmpl w:val="C8F4AF44"/>
+    <w:lvl w:ilvl="0">
+      <w:start w:val="1"/>
+      <w:numFmt w:val="decimal"/>
+      <w:lvlText w:val="%1"/>
+      <w:lvlJc w:val="left"/>
+      <w:pPr>
+        <w:ind w:left="540" w:hanging="540"/>
+      </w:pPr>
+      <w:rPr>
+        <w:rFonts w:hint="default"/>
+      </w:rPr>
+    </w:lvl>
+    <w:lvl w:ilvl="1">
+      <w:start w:val="1"/>
+      <w:numFmt w:val="decimal"/>
+      <w:lvlText w:val="%1.%2"/>
+      <w:lvlJc w:val="left"/>
+      <w:pPr>
+        <w:ind w:left="540" w:hanging="540"/>
+      </w:pPr>
+      <w:rPr>
+        <w:rFonts w:hint="default"/>
+      </w:rPr>
+    </w:lvl>
+    <w:lvl w:ilvl="2">
+      <w:start w:val="1"/>
+      <w:numFmt w:val="decimal"/>
+      <w:lvlText w:val="%1.%2.%3"/>
+      <w:lvlJc w:val="left"/>
+      <w:pPr>
+        <w:ind w:left="720" w:hanging="720"/>
+      </w:pPr>
+      <w:rPr>
+        <w:rFonts w:hint="default"/>
+      </w:rPr>
+    </w:lvl>
+    <w:lvl w:ilvl="3">
+      <w:start w:val="1"/>
+      <w:numFmt w:val="decimal"/>
+      <w:lvlText w:val="%1.%2.%3.%4"/>
+      <w:lvlJc w:val="left"/>
+      <w:pPr>
+        <w:ind w:left="720" w:hanging="720"/>
+      </w:pPr>
+      <w:rPr>
+        <w:rFonts w:hint="default"/>
+      </w:rPr>
+    </w:lvl>
+    <w:lvl w:ilvl="4">
+      <w:start w:val="1"/>
+      <w:numFmt w:val="decimal"/>
+      <w:lvlText w:val="%1.%2.%3.%4.%5"/>
+      <w:lvlJc w:val="left"/>
+      <w:pPr>
+        <w:ind w:left="1080" w:hanging="1080"/>
+      </w:pPr>
+      <w:rPr>
+        <w:rFonts w:hint="default"/>
+      </w:rPr>
+    </w:lvl>
+    <w:lvl w:ilvl="5">
+      <w:start w:val="1"/>
+      <w:numFmt w:val="decimal"/>
+      <w:lvlText w:val="%1.%2.%3.%4.%5.%6"/>
+      <w:lvlJc w:val="left"/>
+      <w:pPr>
+        <w:ind w:left="1080" w:hanging="1080"/>
+      </w:pPr>
+      <w:rPr>
+        <w:rFonts w:hint="default"/>
+      </w:rPr>
+    </w:lvl>
+    <w:lvl w:ilvl="6">
+      <w:start w:val="1"/>
+      <w:numFmt w:val="decimal"/>
+      <w:lvlText w:val="%1.%2.%3.%4.%5.%6.%7"/>
+      <w:lvlJc w:val="left"/>
+      <w:pPr>
+        <w:ind w:left="1440" w:hanging="1440"/>
+      </w:pPr>
+      <w:rPr>
+        <w:rFonts w:hint="default"/>
+      </w:rPr>
+    </w:lvl>
+    <w:lvl w:ilvl="7">
+      <w:start w:val="1"/>
+      <w:numFmt w:val="decimal"/>
+      <w:lvlText w:val="%1.%2.%3.%4.%5.%6.%7.%8"/>
+      <w:lvlJc w:val="left"/>
+      <w:pPr>
+        <w:ind w:left="1440" w:hanging="1440"/>
+      </w:pPr>
+      <w:rPr>
+        <w:rFonts w:hint="default"/>
+      </w:rPr>
+    </w:lvl>
+    <w:lvl w:ilvl="8">
+      <w:start w:val="1"/>
+      <w:numFmt w:val="decimal"/>
+      <w:lvlText w:val="%1.%2.%3.%4.%5.%6.%7.%8.%9"/>
+      <w:lvlJc w:val="left"/>
+      <w:pPr>
+        <w:ind w:left="1800" w:hanging="1800"/>
+      </w:pPr>
+      <w:rPr>
+        <w:rFonts w:hint="default"/>
+      </w:rPr>
+    </w:lvl>
+  </w:abstractNum>
   <w:num w:numId="1" w16cid:durableId="130641033">
-    <w:abstractNumId w:val="0"/>
+    <w:abstractNumId w:val="1"/>
   </w:num>
   <w:num w:numId="2" w16cid:durableId="8339816">
+    <w:abstractNumId w:val="3"/>
+  </w:num>
+  <w:num w:numId="3" w16cid:durableId="1171144201">
     <w:abstractNumId w:val="2"/>
   </w:num>
-  <w:num w:numId="3" w16cid:durableId="1171144201">
-    <w:abstractNumId w:val="1"/>
+  <w:num w:numId="4" w16cid:durableId="719480876">
+    <w:abstractNumId w:val="4"/>
+  </w:num>
+  <w:num w:numId="5" w16cid:durableId="1687709808">
+    <w:abstractNumId w:val="0"/>
+    <w:lvlOverride w:ilvl="0">
+      <w:startOverride w:val="1"/>
+    </w:lvlOverride>
   </w:num>
 </w:numbering>
 </file>
@@ -2209,7 +2464,7 @@
     <w:lsdException w:name="Medium Shading 2 Accent 1" w:uiPriority="64"/>
     <w:lsdException w:name="Medium List 1 Accent 1" w:uiPriority="65"/>
     <w:lsdException w:name="Revision" w:semiHidden="1"/>
-    <w:lsdException w:name="List Paragraph" w:uiPriority="34" w:qFormat="1"/>
+    <w:lsdException w:name="List Paragraph" w:uiPriority="0" w:qFormat="1"/>
     <w:lsdException w:name="Quote" w:uiPriority="29" w:qFormat="1"/>
     <w:lsdException w:name="Intense Quote" w:uiPriority="30" w:qFormat="1"/>
     <w:lsdException w:name="Medium List 2 Accent 1" w:uiPriority="66"/>
@@ -2611,7 +2866,6 @@
   <w:style w:type="character" w:default="1" w:styleId="Policepardfaut">
     <w:name w:val="Default Paragraph Font"/>
     <w:uiPriority w:val="1"/>
-    <w:semiHidden/>
     <w:unhideWhenUsed/>
   </w:style>
   <w:style w:type="table" w:default="1" w:styleId="TableauNormal">
@@ -2844,7 +3098,6 @@
   <w:style w:type="paragraph" w:styleId="Paragraphedeliste">
     <w:name w:val="List Paragraph"/>
     <w:basedOn w:val="Normal"/>
-    <w:uiPriority w:val="34"/>
     <w:qFormat/>
     <w:rsid w:val="000C646C"/>
     <w:pPr>
@@ -3363,6 +3616,26 @@
 </file>
 
 <file path=customXml/item2.xml><?xml version="1.0" encoding="utf-8"?>
+<p:properties xmlns:p="http://schemas.microsoft.com/office/2006/metadata/properties" xmlns:xsi="http://www.w3.org/2001/XMLSchema-instance" xmlns:pc="http://schemas.microsoft.com/office/infopath/2007/PartnerControls">
+  <documentManagement>
+    <TaxCatchAll xmlns="c35d72ba-d11a-41f7-ad9c-c2b314695d89" xsi:nil="true"/>
+    <lcf76f155ced4ddcb4097134ff3c332f xmlns="476e28a0-7352-492b-9eee-708d9213c5a9">
+      <Terms xmlns="http://schemas.microsoft.com/office/infopath/2007/PartnerControls"/>
+    </lcf76f155ced4ddcb4097134ff3c332f>
+  </documentManagement>
+</p:properties>
+</file>
+
+<file path=customXml/item3.xml><?xml version="1.0" encoding="utf-8"?>
+<?mso-contentType ?>
+<FormTemplates xmlns="http://schemas.microsoft.com/sharepoint/v3/contenttype/forms">
+  <Display>DocumentLibraryForm</Display>
+  <Edit>DocumentLibraryForm</Edit>
+  <New>DocumentLibraryForm</New>
+</FormTemplates>
+</file>
+
+<file path=customXml/item4.xml><?xml version="1.0" encoding="utf-8"?>
 <ct:contentTypeSchema xmlns:ct="http://schemas.microsoft.com/office/2006/metadata/contentType" xmlns:ma="http://schemas.microsoft.com/office/2006/metadata/properties/metaAttributes" ct:_="" ma:_="" ma:contentTypeName="Document" ma:contentTypeID="0x0101007951270E050E0C49AB37209493507014" ma:contentTypeVersion="18" ma:contentTypeDescription="Crée un document." ma:contentTypeScope="" ma:versionID="a9e34234e26ebebaf91bed1426e32745">
   <xsd:schema xmlns:xsd="http://www.w3.org/2001/XMLSchema" xmlns:xs="http://www.w3.org/2001/XMLSchema" xmlns:p="http://schemas.microsoft.com/office/2006/metadata/properties" xmlns:ns2="476e28a0-7352-492b-9eee-708d9213c5a9" xmlns:ns3="c35d72ba-d11a-41f7-ad9c-c2b314695d89" targetNamespace="http://schemas.microsoft.com/office/2006/metadata/properties" ma:root="true" ma:fieldsID="fe05b96aa1b15350154a7bfce677d742" ns2:_="" ns3:_="">
     <xsd:import namespace="476e28a0-7352-492b-9eee-708d9213c5a9"/>
@@ -3611,26 +3884,6 @@
 </ct:contentTypeSchema>
 </file>
 
-<file path=customXml/item3.xml><?xml version="1.0" encoding="utf-8"?>
-<?mso-contentType ?>
-<FormTemplates xmlns="http://schemas.microsoft.com/sharepoint/v3/contenttype/forms">
-  <Display>DocumentLibraryForm</Display>
-  <Edit>DocumentLibraryForm</Edit>
-  <New>DocumentLibraryForm</New>
-</FormTemplates>
-</file>
-
-<file path=customXml/item4.xml><?xml version="1.0" encoding="utf-8"?>
-<p:properties xmlns:p="http://schemas.microsoft.com/office/2006/metadata/properties" xmlns:xsi="http://www.w3.org/2001/XMLSchema-instance" xmlns:pc="http://schemas.microsoft.com/office/infopath/2007/PartnerControls">
-  <documentManagement>
-    <TaxCatchAll xmlns="c35d72ba-d11a-41f7-ad9c-c2b314695d89" xsi:nil="true"/>
-    <lcf76f155ced4ddcb4097134ff3c332f xmlns="476e28a0-7352-492b-9eee-708d9213c5a9">
-      <Terms xmlns="http://schemas.microsoft.com/office/infopath/2007/PartnerControls"/>
-    </lcf76f155ced4ddcb4097134ff3c332f>
-  </documentManagement>
-</p:properties>
-</file>
-
 <file path=customXml/itemProps1.xml><?xml version="1.0" encoding="utf-8"?>
 <ds:datastoreItem xmlns:ds="http://schemas.openxmlformats.org/officeDocument/2006/customXml" ds:itemID="{3F3EA316-0719-4E60-BBDF-F6A6F20F22BE}">
   <ds:schemaRefs>
@@ -3640,13 +3893,39 @@
 </file>
 
 <file path=customXml/itemProps2.xml><?xml version="1.0" encoding="utf-8"?>
-<ds:datastoreItem xmlns:ds="http://schemas.openxmlformats.org/officeDocument/2006/customXml" ds:itemID="{0B7D4D2D-D8B7-45BA-95AE-AED8018D63EE}"/>
+<ds:datastoreItem xmlns:ds="http://schemas.openxmlformats.org/officeDocument/2006/customXml" ds:itemID="{FB4913D3-898B-4C18-90E5-50D8CD290946}">
+  <ds:schemaRefs>
+    <ds:schemaRef ds:uri="http://schemas.microsoft.com/office/2006/metadata/properties"/>
+    <ds:schemaRef ds:uri="http://schemas.microsoft.com/office/infopath/2007/PartnerControls"/>
+    <ds:schemaRef ds:uri="c35d72ba-d11a-41f7-ad9c-c2b314695d89"/>
+    <ds:schemaRef ds:uri="476e28a0-7352-492b-9eee-708d9213c5a9"/>
+  </ds:schemaRefs>
+</ds:datastoreItem>
 </file>
 
 <file path=customXml/itemProps3.xml><?xml version="1.0" encoding="utf-8"?>
-<ds:datastoreItem xmlns:ds="http://schemas.openxmlformats.org/officeDocument/2006/customXml" ds:itemID="{11AAF2BC-4EE4-40D9-9686-7E5A3532F374}"/>
+<ds:datastoreItem xmlns:ds="http://schemas.openxmlformats.org/officeDocument/2006/customXml" ds:itemID="{11AAF2BC-4EE4-40D9-9686-7E5A3532F374}">
+  <ds:schemaRefs>
+    <ds:schemaRef ds:uri="http://schemas.microsoft.com/sharepoint/v3/contenttype/forms"/>
+  </ds:schemaRefs>
+</ds:datastoreItem>
 </file>
 
 <file path=customXml/itemProps4.xml><?xml version="1.0" encoding="utf-8"?>
-<ds:datastoreItem xmlns:ds="http://schemas.openxmlformats.org/officeDocument/2006/customXml" ds:itemID="{FB4913D3-898B-4C18-90E5-50D8CD290946}"/>
+<ds:datastoreItem xmlns:ds="http://schemas.openxmlformats.org/officeDocument/2006/customXml" ds:itemID="{0B7D4D2D-D8B7-45BA-95AE-AED8018D63EE}">
+  <ds:schemaRefs>
+    <ds:schemaRef ds:uri="http://schemas.microsoft.com/office/2006/metadata/contentType"/>
+    <ds:schemaRef ds:uri="http://schemas.microsoft.com/office/2006/metadata/properties/metaAttributes"/>
+    <ds:schemaRef ds:uri="http://www.w3.org/2001/XMLSchema"/>
+    <ds:schemaRef ds:uri="http://schemas.microsoft.com/office/2006/metadata/properties"/>
+    <ds:schemaRef ds:uri="476e28a0-7352-492b-9eee-708d9213c5a9"/>
+    <ds:schemaRef ds:uri="c35d72ba-d11a-41f7-ad9c-c2b314695d89"/>
+    <ds:schemaRef ds:uri="http://schemas.microsoft.com/office/2006/documentManagement/types"/>
+    <ds:schemaRef ds:uri="http://schemas.microsoft.com/office/infopath/2007/PartnerControls"/>
+    <ds:schemaRef ds:uri="http://schemas.openxmlformats.org/package/2006/metadata/core-properties"/>
+    <ds:schemaRef ds:uri="http://purl.org/dc/elements/1.1/"/>
+    <ds:schemaRef ds:uri="http://purl.org/dc/terms/"/>
+    <ds:schemaRef ds:uri="http://schemas.microsoft.com/internal/obd"/>
+  </ds:schemaRefs>
+</ds:datastoreItem>
 </file>
</xml_diff>